<commit_message>
fix: docx wording polish
</commit_message>
<xml_diff>
--- a/docs/templates/invoice.docx
+++ b/docs/templates/invoice.docx
@@ -706,8 +706,7 @@
       <w:tr>
         <w:tc>
           <w:tcPr>
-            <w:tcW w:type="dxa" w:w="1320"/>
-            <w:gridSpan w:val="5"/>
+            <w:tcW w:type="dxa" w:w="420"/>
             <w:vAlign w:val="center"/>
             <w:tcMar>
               <w:top w:w="100" w:type="dxa"/>
@@ -717,20 +716,69 @@
             </w:tcMar>
           </w:tcPr>
           <w:p>
-            <w:pPr>
-              <w:keepNext w:val="0"/>
-              <w:spacing w:before="0" w:after="0" w:line="252" w:lineRule="auto"/>
-            </w:pPr>
             <w:r>
-              <w:rPr>
-                <w:rFonts w:ascii="Arial" w:hAnsi="Arial" w:eastAsia="Arial"/>
-                <w:b w:val="0"/>
-                <w:i w:val="0"/>
-                <w:color w:val="222222"/>
-                <w:sz w:val="18"/>
-              </w:rPr>
-              <w:t>Итого к оплате</w:t>
+              <w:t>Итого</w:t>
             </w:r>
+          </w:p>
+        </w:tc>
+        <w:tc>
+          <w:tcPr>
+            <w:tcW w:type="dxa" w:w="3780"/>
+            <w:vAlign w:val="center"/>
+            <w:tcMar>
+              <w:top w:w="100" w:type="dxa"/>
+              <w:left w:w="120" w:type="dxa"/>
+              <w:bottom w:w="100" w:type="dxa"/>
+              <w:right w:w="120" w:type="dxa"/>
+            </w:tcMar>
+          </w:tcPr>
+          <w:p>
+            <w:r/>
+          </w:p>
+        </w:tc>
+        <w:tc>
+          <w:tcPr>
+            <w:tcW w:type="dxa" w:w="760"/>
+            <w:vAlign w:val="center"/>
+            <w:tcMar>
+              <w:top w:w="100" w:type="dxa"/>
+              <w:left w:w="120" w:type="dxa"/>
+              <w:bottom w:w="100" w:type="dxa"/>
+              <w:right w:w="120" w:type="dxa"/>
+            </w:tcMar>
+          </w:tcPr>
+          <w:p>
+            <w:r/>
+          </w:p>
+        </w:tc>
+        <w:tc>
+          <w:tcPr>
+            <w:tcW w:type="dxa" w:w="900"/>
+            <w:vAlign w:val="center"/>
+            <w:tcMar>
+              <w:top w:w="100" w:type="dxa"/>
+              <w:left w:w="120" w:type="dxa"/>
+              <w:bottom w:w="100" w:type="dxa"/>
+              <w:right w:w="120" w:type="dxa"/>
+            </w:tcMar>
+          </w:tcPr>
+          <w:p>
+            <w:r/>
+          </w:p>
+        </w:tc>
+        <w:tc>
+          <w:tcPr>
+            <w:tcW w:type="dxa" w:w="1320"/>
+            <w:vAlign w:val="center"/>
+            <w:tcMar>
+              <w:top w:w="100" w:type="dxa"/>
+              <w:left w:w="120" w:type="dxa"/>
+              <w:bottom w:w="100" w:type="dxa"/>
+              <w:right w:w="120" w:type="dxa"/>
+            </w:tcMar>
+          </w:tcPr>
+          <w:p>
+            <w:r/>
           </w:p>
         </w:tc>
         <w:tc>

</xml_diff>

<commit_message>
fix: invoice wording and client signatures
</commit_message>
<xml_diff>
--- a/docs/templates/invoice.docx
+++ b/docs/templates/invoice.docx
@@ -276,7 +276,7 @@
                 <w:color w:val="222222"/>
                 <w:sz w:val="18"/>
               </w:rPr>
-              <w:t>{{CLIENT_TYPE}} «{{CLIENT_NAME}}», ИНН {{INN}}</w:t>
+              <w:t>{{CLIENT_NAME}}, ИНН {{INN}}</w:t>
             </w:r>
           </w:p>
         </w:tc>
@@ -860,7 +860,7 @@
           <w:color w:val="222222"/>
           <w:sz w:val="21"/>
         </w:rPr>
-        <w:t>{{TOTAL_WORDS}} рублей 00 копеек.</w:t>
+        <w:t>{{TOTAL_WORDS}}.</w:t>
       </w:r>
     </w:p>
     <w:p>

</xml_diff>